<commit_message>
File variables are updated with monday colmn names
</commit_message>
<xml_diff>
--- a/dock_tempaltes/allocation_notice_gmo.docx
+++ b/dock_tempaltes/allocation_notice_gmo.docx
@@ -32,7 +32,28 @@
           <w:highlight w:val="white"/>
           <w:rtl w:val="0"/>
         </w:rPr>
-        <w:t xml:space="preserve">{{ notice_date }}</w:t>
+        <w:t xml:space="preserve">{{ </w:t>
+      </w:r>
+      <w:r>
+        <w:rPr>
+          <w:rFonts w:ascii="Roboto" w:cs="Roboto" w:eastAsia="Roboto" w:hAnsi="Roboto"/>
+          <w:color w:val="333333"/>
+          <w:sz w:val="23"/>
+          <w:szCs w:val="23"/>
+          <w:highlight w:val="white"/>
+          <w:rtl w:val="0"/>
+        </w:rPr>
+        <w:t xml:space="preserve">date_mkzv5nsh</w:t>
+      </w:r>
+      <w:r>
+        <w:rPr>
+          <w:color w:val="111111"/>
+          <w:sz w:val="23"/>
+          <w:szCs w:val="23"/>
+          <w:highlight w:val="white"/>
+          <w:rtl w:val="0"/>
+        </w:rPr>
+        <w:t xml:space="preserve"> }}</w:t>
       </w:r>
       <w:r>
         <w:rPr>
@@ -75,15 +96,13 @@
       </w:pPr>
       <w:r>
         <w:rPr>
-          <w:b w:val="1"/>
-          <w:bCs w:val="1"/>
           <w:color w:val="111111"/>
           <w:sz w:val="21"/>
           <w:szCs w:val="21"/>
           <w:highlight w:val="white"/>
           <w:rtl w:val="0"/>
         </w:rPr>
-        <w:t xml:space="preserve">{{ recipient_name }}</w:t>
+        <w:t xml:space="preserve">{{ board_relation_mkzvceme }}</w:t>
       </w:r>
       <w:r>
         <w:rPr>
@@ -232,7 +251,7 @@
       </w:pPr>
       <w:sdt>
         <w:sdtPr>
-          <w:id w:val="1527054786"/>
+          <w:id w:val="-1151507729"/>
           <w:tag w:val="goog_rdk_0"/>
         </w:sdtPr>
         <w:sdtContent>
@@ -293,7 +312,7 @@
       </w:pPr>
       <w:sdt>
         <w:sdtPr>
-          <w:id w:val="829959763"/>
+          <w:id w:val="1659144843"/>
           <w:tag w:val="goog_rdk_1"/>
         </w:sdtPr>
         <w:sdtContent>
@@ -386,8 +405,6 @@
           <w:smallCaps w:val="0"/>
           <w:strike w:val="0"/>
           <w:color w:val="000000"/>
-          <w:sz w:val="21"/>
-          <w:szCs w:val="21"/>
           <w:u w:val="none"/>
           <w:shd w:fill="auto" w:val="clear"/>
           <w:vertAlign w:val="baseline"/>
@@ -405,21 +422,21 @@
         <w:spacing w:line="276" w:lineRule="auto"/>
         <w:rPr>
           <w:rFonts w:ascii="Times New Roman" w:cs="Times New Roman" w:eastAsia="Times New Roman" w:hAnsi="Times New Roman"/>
-          <w:sz w:val="24"/>
-          <w:szCs w:val="24"/>
+          <w:sz w:val="22"/>
+          <w:szCs w:val="22"/>
         </w:rPr>
       </w:pPr>
       <w:sdt>
         <w:sdtPr>
-          <w:id w:val="629082612"/>
+          <w:id w:val="609862465"/>
           <w:tag w:val="goog_rdk_2"/>
         </w:sdtPr>
         <w:sdtContent>
           <w:r>
             <w:rPr>
               <w:rFonts w:ascii="Gungsuh" w:cs="Gungsuh" w:eastAsia="Gungsuh" w:hAnsi="Gungsuh"/>
-              <w:sz w:val="24"/>
-              <w:szCs w:val="24"/>
+              <w:sz w:val="22"/>
+              <w:szCs w:val="22"/>
               <w:rtl w:val="0"/>
             </w:rPr>
             <w:t xml:space="preserve">グローバル・ロジスティックス・サービス株式会社　</w:t>
@@ -428,48 +445,78 @@
       </w:sdt>
       <w:sdt>
         <w:sdtPr>
-          <w:id w:val="-64825192"/>
+          <w:id w:val="1313580733"/>
           <w:tag w:val="goog_rdk_3"/>
         </w:sdtPr>
         <w:sdtContent>
           <w:r>
             <w:rPr>
               <w:rFonts w:ascii="Gungsuh" w:cs="Gungsuh" w:eastAsia="Gungsuh" w:hAnsi="Gungsuh"/>
-              <w:sz w:val="24"/>
-              <w:szCs w:val="24"/>
+              <w:sz w:val="22"/>
+              <w:szCs w:val="22"/>
               <w:rtl w:val="0"/>
             </w:rPr>
-            <w:t xml:space="preserve">第{{ bond_number }}回普通社債</w:t>
+            <w:t xml:space="preserve">第{{ </w:t>
           </w:r>
         </w:sdtContent>
       </w:sdt>
       <w:r>
         <w:rPr>
-          <w:rtl w:val="0"/>
-        </w:rPr>
-      </w:r>
-    </w:p>
-    <w:p>
-      <w:pPr>
-        <w:pStyle w:val="Title"/>
-        <w:spacing w:line="276" w:lineRule="auto"/>
-        <w:rPr>
-          <w:rFonts w:ascii="Times New Roman" w:cs="Times New Roman" w:eastAsia="Times New Roman" w:hAnsi="Times New Roman"/>
-          <w:sz w:val="24"/>
-          <w:szCs w:val="24"/>
-        </w:rPr>
-      </w:pPr>
+          <w:rFonts w:ascii="Roboto" w:cs="Roboto" w:eastAsia="Roboto" w:hAnsi="Roboto"/>
+          <w:b w:val="0"/>
+          <w:bCs w:val="0"/>
+          <w:color w:val="333333"/>
+          <w:sz w:val="22"/>
+          <w:szCs w:val="22"/>
+          <w:highlight w:val="white"/>
+          <w:rtl w:val="0"/>
+        </w:rPr>
+        <w:t xml:space="preserve">numeric_mm2qnce0 </w:t>
+      </w:r>
       <w:sdt>
         <w:sdtPr>
-          <w:id w:val="-1104565400"/>
+          <w:id w:val="-663607582"/>
           <w:tag w:val="goog_rdk_4"/>
         </w:sdtPr>
         <w:sdtContent>
           <w:r>
             <w:rPr>
               <w:rFonts w:ascii="Gungsuh" w:cs="Gungsuh" w:eastAsia="Gungsuh" w:hAnsi="Gungsuh"/>
-              <w:sz w:val="24"/>
-              <w:szCs w:val="24"/>
+              <w:sz w:val="22"/>
+              <w:szCs w:val="22"/>
+              <w:rtl w:val="0"/>
+            </w:rPr>
+            <w:t xml:space="preserve">}}回普通社債</w:t>
+          </w:r>
+        </w:sdtContent>
+      </w:sdt>
+      <w:r>
+        <w:rPr>
+          <w:rtl w:val="0"/>
+        </w:rPr>
+      </w:r>
+    </w:p>
+    <w:p>
+      <w:pPr>
+        <w:pStyle w:val="Title"/>
+        <w:spacing w:line="276" w:lineRule="auto"/>
+        <w:rPr>
+          <w:rFonts w:ascii="Times New Roman" w:cs="Times New Roman" w:eastAsia="Times New Roman" w:hAnsi="Times New Roman"/>
+          <w:sz w:val="22"/>
+          <w:szCs w:val="22"/>
+        </w:rPr>
+      </w:pPr>
+      <w:sdt>
+        <w:sdtPr>
+          <w:id w:val="-2082146728"/>
+          <w:tag w:val="goog_rdk_5"/>
+        </w:sdtPr>
+        <w:sdtContent>
+          <w:r>
+            <w:rPr>
+              <w:rFonts w:ascii="Gungsuh" w:cs="Gungsuh" w:eastAsia="Gungsuh" w:hAnsi="Gungsuh"/>
+              <w:sz w:val="22"/>
+              <w:szCs w:val="22"/>
               <w:rtl w:val="0"/>
             </w:rPr>
             <w:t xml:space="preserve">割当決定通知書</w:t>
@@ -590,8 +637,8 @@
       </w:pPr>
       <w:sdt>
         <w:sdtPr>
-          <w:id w:val="-1863063067"/>
-          <w:tag w:val="goog_rdk_5"/>
+          <w:id w:val="-1782911413"/>
+          <w:tag w:val="goog_rdk_6"/>
         </w:sdtPr>
         <w:sdtContent>
           <w:r>
@@ -617,8 +664,8 @@
       </w:sdt>
       <w:sdt>
         <w:sdtPr>
-          <w:id w:val="-1651843477"/>
-          <w:tag w:val="goog_rdk_6"/>
+          <w:id w:val="-1214024564"/>
+          <w:tag w:val="goog_rdk_7"/>
         </w:sdtPr>
         <w:sdtContent>
           <w:r>
@@ -649,12 +696,32 @@
           <w:szCs w:val="21"/>
           <w:rtl w:val="0"/>
         </w:rPr>
-        <w:t xml:space="preserve">{{ bond_number }}</w:t>
+        <w:t xml:space="preserve">{{ </w:t>
+      </w:r>
+      <w:r>
+        <w:rPr>
+          <w:rFonts w:ascii="Roboto" w:cs="Roboto" w:eastAsia="Roboto" w:hAnsi="Roboto"/>
+          <w:color w:val="333333"/>
+          <w:sz w:val="21"/>
+          <w:szCs w:val="21"/>
+          <w:highlight w:val="white"/>
+          <w:rtl w:val="0"/>
+        </w:rPr>
+        <w:t xml:space="preserve">numeric_mm2qnce0</w:t>
+      </w:r>
+      <w:r>
+        <w:rPr>
+          <w:rFonts w:ascii="Times New Roman" w:cs="Times New Roman" w:eastAsia="Times New Roman" w:hAnsi="Times New Roman"/>
+          <w:sz w:val="21"/>
+          <w:szCs w:val="21"/>
+          <w:rtl w:val="0"/>
+        </w:rPr>
+        <w:t xml:space="preserve"> }}</w:t>
       </w:r>
       <w:sdt>
         <w:sdtPr>
-          <w:id w:val="941823707"/>
-          <w:tag w:val="goog_rdk_7"/>
+          <w:id w:val="-238620810"/>
+          <w:tag w:val="goog_rdk_8"/>
         </w:sdtPr>
         <w:sdtContent>
           <w:r>
@@ -680,8 +747,8 @@
       </w:sdt>
       <w:sdt>
         <w:sdtPr>
-          <w:id w:val="148675708"/>
-          <w:tag w:val="goog_rdk_8"/>
+          <w:id w:val="241057598"/>
+          <w:tag w:val="goog_rdk_9"/>
         </w:sdtPr>
         <w:sdtContent>
           <w:r>
@@ -842,284 +909,32 @@
         <w:rPr>
           <w:rtl w:val="0"/>
         </w:rPr>
-      </w:r>
-    </w:p>
-    <w:sdt>
-      <w:sdtPr>
-        <w:lock w:val="contentLocked"/>
-        <w:id w:val="-1952328139"/>
-        <w:tag w:val="goog_rdk_9"/>
-      </w:sdtPr>
-      <w:sdtContent>
-        <w:tbl>
-          <w:tblPr>
-            <w:tblStyle w:val="Table1"/>
-            <w:tblW w:w="8651.0" w:type="dxa"/>
-            <w:jc w:val="left"/>
-            <w:tblBorders>
-              <w:top w:color="000000" w:space="0" w:sz="8" w:val="single"/>
-              <w:left w:color="000000" w:space="0" w:sz="8" w:val="single"/>
-              <w:bottom w:color="000000" w:space="0" w:sz="8" w:val="single"/>
-              <w:right w:color="000000" w:space="0" w:sz="8" w:val="single"/>
-              <w:insideH w:color="000000" w:space="0" w:sz="8" w:val="single"/>
-              <w:insideV w:color="000000" w:space="0" w:sz="8" w:val="single"/>
-            </w:tblBorders>
-            <w:tblLayout w:type="fixed"/>
-            <w:tblLook w:val="0600"/>
-          </w:tblPr>
-          <w:tblGrid>
-            <w:gridCol w:w="4325.5"/>
-            <w:gridCol w:w="4325.5"/>
-            <w:tblGridChange w:id="0">
-              <w:tblGrid>
-                <w:gridCol w:w="4325.5"/>
-                <w:gridCol w:w="4325.5"/>
-              </w:tblGrid>
-            </w:tblGridChange>
-          </w:tblGrid>
-          <w:tr>
-            <w:trPr>
-              <w:cantSplit w:val="0"/>
-              <w:tblHeader w:val="0"/>
-            </w:trPr>
-            <w:tc>
-              <w:tcPr>
-                <w:shd w:fill="auto" w:val="clear"/>
-                <w:tcMar>
-                  <w:top w:w="100.0" w:type="dxa"/>
-                  <w:left w:w="100.0" w:type="dxa"/>
-                  <w:bottom w:w="100.0" w:type="dxa"/>
-                  <w:right w:w="100.0" w:type="dxa"/>
-                </w:tcMar>
-                <w:vAlign w:val="top"/>
-              </w:tcPr>
-              <w:p>
-                <w:pPr>
-                  <w:keepNext w:val="0"/>
-                  <w:keepLines w:val="0"/>
-                  <w:pageBreakBefore w:val="0"/>
-                  <w:widowControl w:val="0"/>
-                  <w:pBdr>
-                    <w:top w:space="0" w:sz="0" w:val="nil"/>
-                    <w:left w:space="0" w:sz="0" w:val="nil"/>
-                    <w:bottom w:space="0" w:sz="0" w:val="nil"/>
-                    <w:right w:space="0" w:sz="0" w:val="nil"/>
-                    <w:between w:space="0" w:sz="0" w:val="nil"/>
-                  </w:pBdr>
-                  <w:shd w:fill="auto" w:val="clear"/>
-                  <w:spacing w:after="0" w:before="0" w:line="240" w:lineRule="auto"/>
-                  <w:ind w:left="0" w:right="0" w:firstLine="0"/>
-                  <w:jc w:val="left"/>
-                  <w:rPr/>
-                </w:pPr>
-                <w:r>
-                  <w:rPr>
-                    <w:rtl w:val="0"/>
-                  </w:rPr>
-                </w:r>
-              </w:p>
-            </w:tc>
-            <w:tc>
-              <w:tcPr>
-                <w:shd w:fill="auto" w:val="clear"/>
-                <w:tcMar>
-                  <w:top w:w="100.0" w:type="dxa"/>
-                  <w:left w:w="100.0" w:type="dxa"/>
-                  <w:bottom w:w="100.0" w:type="dxa"/>
-                  <w:right w:w="100.0" w:type="dxa"/>
-                </w:tcMar>
-                <w:vAlign w:val="top"/>
-              </w:tcPr>
-              <w:p>
-                <w:pPr>
-                  <w:keepNext w:val="0"/>
-                  <w:keepLines w:val="0"/>
-                  <w:pageBreakBefore w:val="0"/>
-                  <w:widowControl w:val="0"/>
-                  <w:pBdr>
-                    <w:top w:space="0" w:sz="0" w:val="nil"/>
-                    <w:left w:space="0" w:sz="0" w:val="nil"/>
-                    <w:bottom w:space="0" w:sz="0" w:val="nil"/>
-                    <w:right w:space="0" w:sz="0" w:val="nil"/>
-                    <w:between w:space="0" w:sz="0" w:val="nil"/>
-                  </w:pBdr>
-                  <w:shd w:fill="auto" w:val="clear"/>
-                  <w:spacing w:after="0" w:before="0" w:line="240" w:lineRule="auto"/>
-                  <w:ind w:left="0" w:right="0" w:firstLine="0"/>
-                  <w:jc w:val="left"/>
-                  <w:rPr/>
-                </w:pPr>
-                <w:r>
-                  <w:rPr>
-                    <w:rtl w:val="0"/>
-                  </w:rPr>
-                </w:r>
-              </w:p>
-            </w:tc>
-          </w:tr>
-          <w:tr>
-            <w:trPr>
-              <w:cantSplit w:val="0"/>
-              <w:tblHeader w:val="0"/>
-            </w:trPr>
-            <w:tc>
-              <w:tcPr>
-                <w:shd w:fill="auto" w:val="clear"/>
-                <w:tcMar>
-                  <w:top w:w="100.0" w:type="dxa"/>
-                  <w:left w:w="100.0" w:type="dxa"/>
-                  <w:bottom w:w="100.0" w:type="dxa"/>
-                  <w:right w:w="100.0" w:type="dxa"/>
-                </w:tcMar>
-                <w:vAlign w:val="top"/>
-              </w:tcPr>
-              <w:p>
-                <w:pPr>
-                  <w:keepNext w:val="0"/>
-                  <w:keepLines w:val="0"/>
-                  <w:pageBreakBefore w:val="0"/>
-                  <w:widowControl w:val="0"/>
-                  <w:pBdr>
-                    <w:top w:space="0" w:sz="0" w:val="nil"/>
-                    <w:left w:space="0" w:sz="0" w:val="nil"/>
-                    <w:bottom w:space="0" w:sz="0" w:val="nil"/>
-                    <w:right w:space="0" w:sz="0" w:val="nil"/>
-                    <w:between w:space="0" w:sz="0" w:val="nil"/>
-                  </w:pBdr>
-                  <w:shd w:fill="auto" w:val="clear"/>
-                  <w:spacing w:after="0" w:before="0" w:line="240" w:lineRule="auto"/>
-                  <w:ind w:left="0" w:right="0" w:firstLine="0"/>
-                  <w:jc w:val="left"/>
-                  <w:rPr/>
-                </w:pPr>
-                <w:r>
-                  <w:rPr>
-                    <w:rtl w:val="0"/>
-                  </w:rPr>
-                </w:r>
-              </w:p>
-            </w:tc>
-            <w:tc>
-              <w:tcPr>
-                <w:shd w:fill="auto" w:val="clear"/>
-                <w:tcMar>
-                  <w:top w:w="100.0" w:type="dxa"/>
-                  <w:left w:w="100.0" w:type="dxa"/>
-                  <w:bottom w:w="100.0" w:type="dxa"/>
-                  <w:right w:w="100.0" w:type="dxa"/>
-                </w:tcMar>
-                <w:vAlign w:val="top"/>
-              </w:tcPr>
-              <w:p>
-                <w:pPr>
-                  <w:keepNext w:val="0"/>
-                  <w:keepLines w:val="0"/>
-                  <w:pageBreakBefore w:val="0"/>
-                  <w:widowControl w:val="0"/>
-                  <w:pBdr>
-                    <w:top w:space="0" w:sz="0" w:val="nil"/>
-                    <w:left w:space="0" w:sz="0" w:val="nil"/>
-                    <w:bottom w:space="0" w:sz="0" w:val="nil"/>
-                    <w:right w:space="0" w:sz="0" w:val="nil"/>
-                    <w:between w:space="0" w:sz="0" w:val="nil"/>
-                  </w:pBdr>
-                  <w:shd w:fill="auto" w:val="clear"/>
-                  <w:spacing w:after="0" w:before="0" w:line="240" w:lineRule="auto"/>
-                  <w:ind w:left="0" w:right="0" w:firstLine="0"/>
-                  <w:jc w:val="left"/>
-                  <w:rPr/>
-                </w:pPr>
-                <w:r>
-                  <w:rPr>
-                    <w:rtl w:val="0"/>
-                  </w:rPr>
-                </w:r>
-              </w:p>
-            </w:tc>
-          </w:tr>
-          <w:tr>
-            <w:trPr>
-              <w:cantSplit w:val="0"/>
-              <w:tblHeader w:val="0"/>
-            </w:trPr>
-            <w:tc>
-              <w:tcPr>
-                <w:shd w:fill="auto" w:val="clear"/>
-                <w:tcMar>
-                  <w:top w:w="100.0" w:type="dxa"/>
-                  <w:left w:w="100.0" w:type="dxa"/>
-                  <w:bottom w:w="100.0" w:type="dxa"/>
-                  <w:right w:w="100.0" w:type="dxa"/>
-                </w:tcMar>
-                <w:vAlign w:val="top"/>
-              </w:tcPr>
-              <w:p>
-                <w:pPr>
-                  <w:keepNext w:val="0"/>
-                  <w:keepLines w:val="0"/>
-                  <w:pageBreakBefore w:val="0"/>
-                  <w:widowControl w:val="0"/>
-                  <w:pBdr>
-                    <w:top w:space="0" w:sz="0" w:val="nil"/>
-                    <w:left w:space="0" w:sz="0" w:val="nil"/>
-                    <w:bottom w:space="0" w:sz="0" w:val="nil"/>
-                    <w:right w:space="0" w:sz="0" w:val="nil"/>
-                    <w:between w:space="0" w:sz="0" w:val="nil"/>
-                  </w:pBdr>
-                  <w:shd w:fill="auto" w:val="clear"/>
-                  <w:spacing w:after="0" w:before="0" w:line="240" w:lineRule="auto"/>
-                  <w:ind w:left="0" w:right="0" w:firstLine="0"/>
-                  <w:jc w:val="left"/>
-                  <w:rPr/>
-                </w:pPr>
-                <w:r>
-                  <w:rPr>
-                    <w:rtl w:val="0"/>
-                  </w:rPr>
-                </w:r>
-              </w:p>
-            </w:tc>
-            <w:tc>
-              <w:tcPr>
-                <w:shd w:fill="auto" w:val="clear"/>
-                <w:tcMar>
-                  <w:top w:w="100.0" w:type="dxa"/>
-                  <w:left w:w="100.0" w:type="dxa"/>
-                  <w:bottom w:w="100.0" w:type="dxa"/>
-                  <w:right w:w="100.0" w:type="dxa"/>
-                </w:tcMar>
-                <w:vAlign w:val="top"/>
-              </w:tcPr>
-              <w:p>
-                <w:pPr>
-                  <w:keepNext w:val="0"/>
-                  <w:keepLines w:val="0"/>
-                  <w:pageBreakBefore w:val="0"/>
-                  <w:widowControl w:val="0"/>
-                  <w:pBdr>
-                    <w:top w:space="0" w:sz="0" w:val="nil"/>
-                    <w:left w:space="0" w:sz="0" w:val="nil"/>
-                    <w:bottom w:space="0" w:sz="0" w:val="nil"/>
-                    <w:right w:space="0" w:sz="0" w:val="nil"/>
-                    <w:between w:space="0" w:sz="0" w:val="nil"/>
-                  </w:pBdr>
-                  <w:shd w:fill="auto" w:val="clear"/>
-                  <w:spacing w:after="0" w:before="0" w:line="240" w:lineRule="auto"/>
-                  <w:ind w:left="0" w:right="0" w:firstLine="0"/>
-                  <w:jc w:val="left"/>
-                  <w:rPr/>
-                </w:pPr>
-                <w:r>
-                  <w:rPr>
-                    <w:rtl w:val="0"/>
-                  </w:rPr>
-                </w:r>
-              </w:p>
-            </w:tc>
-          </w:tr>
-        </w:tbl>
-      </w:sdtContent>
-    </w:sdt>
+        <w:t xml:space="preserve">割当口数　　：{{ numeric_mkzr5kqz }}万円（{{ numeric_mm35kh48 }}口）</w:t>
+      </w:r>
+    </w:p>
+    <w:p>
+      <w:pPr>
+        <w:spacing w:line="276" w:lineRule="auto"/>
+        <w:rPr>
+          <w:rFonts w:ascii="Times New Roman" w:cs="Times New Roman" w:eastAsia="Times New Roman" w:hAnsi="Times New Roman"/>
+        </w:rPr>
+      </w:pPr>
+      <w:sdt>
+        <w:sdtPr>
+          <w:id w:val="2135790838"/>
+          <w:tag w:val="goog_rdk_10"/>
+        </w:sdtPr>
+        <w:sdtContent>
+          <w:r>
+            <w:rPr>
+              <w:rFonts w:ascii="Gungsuh" w:cs="Gungsuh" w:eastAsia="Gungsuh" w:hAnsi="Gungsuh"/>
+              <w:rtl w:val="0"/>
+            </w:rPr>
+            <w:t xml:space="preserve">払込期日　　：{{ date_mkzvtpra }}</w:t>
+          </w:r>
+        </w:sdtContent>
+      </w:sdt>
+    </w:p>
     <w:p>
       <w:pPr>
         <w:spacing w:line="276" w:lineRule="auto"/>
@@ -1129,6 +944,7 @@
         <w:rPr>
           <w:rtl w:val="0"/>
         </w:rPr>
+        <w:t xml:space="preserve">払込金融機関：{{ bank_info }}</w:t>
       </w:r>
     </w:p>
     <w:p>
@@ -1188,8 +1004,8 @@
       </w:pPr>
       <w:sdt>
         <w:sdtPr>
-          <w:id w:val="-542278948"/>
-          <w:tag w:val="goog_rdk_10"/>
+          <w:id w:val="1807504752"/>
+          <w:tag w:val="goog_rdk_11"/>
         </w:sdtPr>
         <w:sdtContent>
           <w:r>
@@ -1404,13 +1220,6 @@
       <w:sz w:val="48"/>
       <w:szCs w:val="48"/>
     </w:rPr>
-  </w:style>
-  <w:style w:type="table" w:styleId="Table1">
-    <w:basedOn w:val="TableNormal"/>
-    <w:tblPr>
-      <w:tblStyleRowBandSize w:val="1"/>
-      <w:tblStyleColBandSize w:val="1"/>
-    </w:tblPr>
   </w:style>
 </w:styles>
 </file>
@@ -1737,7 +1546,7 @@
 
 <file path=customXML/item1.xml><?xml version="1.0" encoding="utf-8"?>
 <go:gDocsCustomXmlDataStorage xmlns:go="http://customooxmlschemas.google.com/" xmlns:r="http://schemas.openxmlformats.org/officeDocument/2006/relationships" uri="GoogleDocsCustomDataVersion2">
-  <go:docsCustomData xmlns:go="http://customooxmlschemas.google.com/" roundtripDataSignature="AMtx7mjhtE6gj4C8rHK5Qxw2xtM8wC1qBA==">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</go:docsCustomData>
+  <go:docsCustomData xmlns:go="http://customooxmlschemas.google.com/" roundtripDataSignature="AMtx7mgkoQmMfFwqbxzoq8wzEQBb/JTwHg==">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</go:docsCustomData>
 </go:gDocsCustomXmlDataStorage>
 </file>
 

</xml_diff>